<commit_message>
Include authorized team contacts in final jury presentation and documents
</commit_message>
<xml_diff>
--- a/docs/delivery/gost/documentation.docx
+++ b/docs/delivery/gost/documentation.docx
@@ -10265,7 +10265,7 @@
           <w:color w:val="000000"/>
           <w:u w:val="none"/>
         </w:rPr>
-        <w:t xml:space="preserve">Владелец предоставил PDF «fsp-lct-2026-IZMENENIA» и поручил перенести сведения о своей команде в конкурсную презентацию. Логотип «Студия 37» и четыре портрета взяты из этого файла; имена и роли не изменены. Телефоны и личные Telegram исключены из публичного PPTX, оригинальный PDF хранится вне Git. Происхождение и SHA-256 зафиксированы в </w:t>
+        <w:t xml:space="preserve">Владелец предоставил PDF «fsp-lct-2026-IZMENENIA» и поручил перенести сведения о своей команде в конкурсную презентацию. Логотип «Студия 37» и четыре портрета взяты из этого файла; имена и роли не изменены. Телефоны и Telegram перенесены в публичный PPTX. 11 октября 2026 года владелец подтвердил, что участники согласны на публикацию всех предоставленных сведений и контактов. Оригинальный PDF хранится вне Git. Происхождение и SHA-256 зафиксированы в </w:t>
       </w:r>
       <w:hyperlink r:id="rId53">
         <w:r>
@@ -10893,15 +10893,15 @@
           <w:color w:val="000000"/>
           <w:u w:val="none"/>
         </w:rPr>
-        <w:t xml:space="preserve">PPTX уточнён по предоставленному 16-страничному PDF: в слайды 1–4 добавлены подтверждённые сведения о команде, имена, роли и фотографии без телефонов и Telegram; слайды 11 и 16 обновлены для v3. Остальные продуктовые слайды сохранены. Общий исходный PPTX не объявляется подтверждённым официальным шаблоном ЛЦТ 2026. SHA-256 файла — </w:t>
-      </w:r>
-      <w:r>
-        <w:rPr>
-          <w:rFonts w:ascii="Times New Roman" w:hAnsi="Times New Roman" w:eastAsia="Times New Roman" w:cs="Times New Roman"/>
-          <w:color w:val="000000"/>
-          <w:u w:val="none"/>
-        </w:rPr>
-        <w:t>736b021a6632fae1da4b6cf7aa1d6eab8412f486b6fd73d77fe036a35d09c9aa</w:t>
+        <w:t xml:space="preserve">PPTX уточнён по предоставленному 16-страничному PDF: в слайды 1–4 добавлены подтверждённые сведения о команде, имена, роли, фотографии, телефоны и Telegram с подтверждённого владельцем согласия участников; слайды 11 и 16 обновлены для v3. Остальные продуктовые слайды сохранены. Общий исходный PPTX не объявляется подтверждённым официальным шаблоном ЛЦТ 2026. SHA-256 файла — </w:t>
+      </w:r>
+      <w:r>
+        <w:rPr>
+          <w:rFonts w:ascii="Times New Roman" w:hAnsi="Times New Roman" w:eastAsia="Times New Roman" w:cs="Times New Roman"/>
+          <w:color w:val="000000"/>
+          <w:u w:val="none"/>
+        </w:rPr>
+        <w:t>d7ac4047bf7911eca25ca1cc31669f189f3ea981f320e31b4464c1c7bbf33982</w:t>
       </w:r>
       <w:r>
         <w:rPr>

</xml_diff>